<commit_message>
Align the Student Notes and Labs companions with the revised chapters
Companions 1-6 now agree with the chapters as revised from the reviews:
active dendrites and back-propagating spikes (2), credit assignment as an
open question and the dopamine reward-prediction-error wording (3), basal
ganglia hyper- and hypokinetic failure modes and hedged coherence and
cerebellar LTD (4), LTD and replay history and hedged neurogenesis,
consolidation, and reconsolidation (5), cone and rod counts, expectation
suppression, and the retrainable light-from-above prior (6), plus notes
for the chapters' new material. Lab 4.2's model now matches the revised
Figure 4.2 (runaway triggered by the input) with recomputed check values;
Lab 4.3 points to the renumbered Figure 4.5. Word and PDF rebuilt.

Co-Authored-By: Claude Opus 5.5 <noreply@anthropic.com>
</commit_message>
<xml_diff>
--- a/docs/companion/Chapter1/Word/How_the_Brain_Learns_Chapter_1_Student_Notes_and_Labs.docx
+++ b/docs/companion/Chapter1/Word/How_the_Brain_Learns_Chapter_1_Student_Notes_and_Labs.docx
@@ -84,7 +84,7 @@
         <w:t xml:space="preserve">Not)</w:t>
       </w:r>
     </w:p>
-    <w:bookmarkStart w:id="29" w:name="student-notes"/>
+    <w:bookmarkStart w:id="31" w:name="student-notes"/>
     <w:p>
       <w:pPr>
         <w:pStyle w:val="Heading1"/>
@@ -159,6 +159,14 @@
         <w:t xml:space="preserve">; that feeling is a product of the system under study, not evidence about it.</w:t>
       </w:r>
     </w:p>
+    <w:p>
+      <w:pPr>
+        <w:pStyle w:val="BodyText"/>
+      </w:pPr>
+      <w:r>
+        <w:t xml:space="preserve">The chapter’s example is Nisbett and Wilson’s stocking experiment: shoppers choosing among four identical pairs preferred the rightmost by about four to one and explained the choice by knit and sheerness, never by position. Fluent reasons are not access to causes.</w:t>
+      </w:r>
+    </w:p>
     <w:bookmarkEnd w:id="21"/>
     <w:bookmarkStart w:id="22" w:name="the-brain-is-not-a-digital-computer"/>
     <w:p>
@@ -254,6 +262,22 @@
         <w:pStyle w:val="FirstParagraph"/>
       </w:pPr>
       <w:r>
+        <w:t xml:space="preserve">Know the numbers behind the contrast: about 86 billion neurons and on the order of a hundred trillion synapses; a spike of about a millisecond and a synaptic delay of about half a millisecond, against transistors that switch in picoseconds. The brain is roughly a million times slower per step, yet it can tell whether a briefly flashed photograph contains an animal within about 150 milliseconds (Thorpe and colleagues, 1996). That leaves room for only about a hundred sequential steps (Feldman and Ballard’s hundred-step constraint), so perception must be massively parallel and shallow, not a long serial program.</w:t>
+      </w:r>
+    </w:p>
+    <w:p>
+      <w:pPr>
+        <w:pStyle w:val="BodyText"/>
+      </w:pPr>
+      <w:r>
+        <w:t xml:space="preserve">The contrast is one of emphasis rather than kind. Von Neumann himself showed in 1952 that reliable computation can be built from unreliable components by redundancy and majority voting.</w:t>
+      </w:r>
+    </w:p>
+    <w:p>
+      <w:pPr>
+        <w:pStyle w:val="BodyText"/>
+      </w:pPr>
+      <w:r>
         <w:t xml:space="preserve">The differences trace back to different goals. Computers are built to produce correct answers to well-specified problems. Brains evolved to keep organisms alive in uncertain, hostile environments. Precision is useful only when it serves survival; flexibility, robustness, and speed frequently matter more.</w:t>
       </w:r>
     </w:p>
@@ -262,7 +286,7 @@
         <w:pStyle w:val="BodyText"/>
       </w:pPr>
       <w:r>
-        <w:t xml:space="preserve">The chapter’s honest formulation is worth memorizing: brains and computers are both physical systems capable of computation under radically different constraints. Neither is a model of the other.</w:t>
+        <w:t xml:space="preserve">The chapter’s honest formulation is worth memorizing: brains and computers are both physical systems capable of computation under radically different constraints. Neither is a model of the other. Marr’s three levels (what is computed, the procedure, the hardware) keep these apart: two systems can compute the same thing while sharing nothing at the level of procedure or hardware.</w:t>
       </w:r>
     </w:p>
     <w:bookmarkEnd w:id="22"/>
@@ -280,7 +304,7 @@
         <w:pStyle w:val="FirstParagraph"/>
       </w:pPr>
       <w:r>
-        <w:t xml:space="preserve">Every thought corresponds to physical change. Signals are ions crossing membranes; components are proteins changing shape, channels opening and closing, molecules diffusing through crowded cells.</w:t>
+        <w:t xml:space="preserve">Every thought corresponds to physical change. Signals are ions crossing membranes; components are proteins changing shape, channels opening and closing, molecules diffusing through crowded cells. The decisive demonstration is Hodgkin and Huxley’s 1952 model of the squid giant axon: four differential equations for a sodium and a potassium current reproduced the impulse’s shape, threshold, and conduction velocity (18.8 meters per second computed against 21.2 measured), with nothing left over.</w:t>
       </w:r>
     </w:p>
     <w:p>
@@ -288,13 +312,21 @@
         <w:pStyle w:val="BodyText"/>
       </w:pPr>
       <w:r>
+        <w:t xml:space="preserve">The energy budget is the constraint that shapes everything else. The brain is about 2 percent of body mass and uses about 20 percent of resting energy, roughly 20 watts. Attwell and Laughlin’s budget for rodent gray matter puts about 47 percent on action potentials, 34 percent on glutamate’s effects on receiving cells, and 13 percent on resting potentials; Lennie calculated that the cortex can afford only about one neuron in a hundred firing at any moment. Sparse codes, low firing rates, and short wiring follow from that budget.</w:t>
+      </w:r>
+    </w:p>
+    <w:p>
+      <w:pPr>
+        <w:pStyle w:val="BodyText"/>
+      </w:pPr>
+      <w:r>
         <w:t xml:space="preserve">The consequences follow directly from physics:</w:t>
       </w:r>
       <w:r>
         <w:br/>
       </w:r>
       <w:r>
-        <w:t xml:space="preserve">- Physical processes take time, so learning is slow because molecular change is slow.</w:t>
+        <w:t xml:space="preserve">- Physical processes take time, so lasting learning is slow because molecular change is slow (one of two reasons; see the next note).</w:t>
       </w:r>
       <w:r>
         <w:br/>
@@ -324,12 +356,42 @@
       </w:r>
     </w:p>
     <w:bookmarkEnd w:id="23"/>
-    <w:bookmarkStart w:id="24" w:name="no-reset-button"/>
+    <w:bookmarkStart w:id="24" w:name="why-learning-is-slow"/>
     <w:p>
       <w:pPr>
         <w:pStyle w:val="Heading2"/>
       </w:pPr>
       <w:r>
+        <w:t xml:space="preserve">Why learning is slow</w:t>
+      </w:r>
+    </w:p>
+    <w:p>
+      <w:pPr>
+        <w:pStyle w:val="FirstParagraph"/>
+      </w:pPr>
+      <w:r>
+        <w:t xml:space="preserve">The chapter gives two reasons, and they are different in kind:</w:t>
+      </w:r>
+      <w:r>
+        <w:br/>
+      </w:r>
+      <w:r>
+        <w:t xml:space="preserve">1) Lasting change is molecular construction. Early potentiation of a synapse takes a minute or two (receptors already waiting near the membrane are inserted), but change that lasts beyond a few hours needs new protein synthesis and structural growth, which take hours; blocking protein synthesis spares the early change and erases the late one. Kandel’s Aplysia work shows the same split: one tail shock gives minutes of sensitization with no new protein, while five spaced shocks give days to weeks that depend on gene expression.</w:t>
+      </w:r>
+      <w:r>
+        <w:br/>
+      </w:r>
+      <w:r>
+        <w:t xml:space="preserve">2) Fast change is dangerous. A system that rewrote itself on every experience would overwrite what it already knew, as McCloskey and Cohen’s catastrophic interference shows for artificial networks. In the complementary learning systems account (McClelland, McNaughton, and O’Reilly, 1995), the hippocampus learns in one exposure and replays to the cortex, which integrates slowly and interleaved with old knowledge. Slow cortical learning is a requirement of stability, not a hardware limitation. Chapter 5 elaborates both reasons.</w:t>
+      </w:r>
+    </w:p>
+    <w:bookmarkEnd w:id="24"/>
+    <w:bookmarkStart w:id="25" w:name="no-reset-button"/>
+    <w:p>
+      <w:pPr>
+        <w:pStyle w:val="Heading2"/>
+      </w:pPr>
+      <w:r>
         <w:t xml:space="preserve">No reset button</w:t>
       </w:r>
     </w:p>
@@ -346,6 +408,14 @@
         <w:pStyle w:val="BodyText"/>
       </w:pPr>
       <w:r>
+        <w:t xml:space="preserve">The chapter’s key experiment is Wiesel and Hubel’s 1963 monocular deprivation: closing one eye of a newborn kitten during a sensitive period left almost every visual cortical neuron answering only to the open eye, largely permanently, while the same closure in an adult cat did nothing. Knudsen found the same logic in owl auditory maps, birdsong, and human language.</w:t>
+      </w:r>
+    </w:p>
+    <w:p>
+      <w:pPr>
+        <w:pStyle w:val="BodyText"/>
+      </w:pPr>
+      <w:r>
         <w:t xml:space="preserve">Three consequences to carry forward:</w:t>
       </w:r>
       <w:r>
@@ -372,11 +442,11 @@
         <w:pStyle w:val="BodyText"/>
       </w:pPr>
       <w:r>
-        <w:t xml:space="preserve">The same logic applies to evolution. It cannot redesign from scratch; it modifies what exists. Workable solutions persist once they support survival, even when better ones exist in principle. Historical contingency is a defining feature of living systems, not a flaw.</w:t>
-      </w:r>
-    </w:p>
-    <w:bookmarkEnd w:id="24"/>
-    <w:bookmarkStart w:id="25" w:name="the-brain-as-an-adaptive-control-system"/>
+        <w:t xml:space="preserve">The same logic applies to evolution. It cannot redesign from scratch; it modifies what exists. Workable solutions persist once they support survival, even when better ones exist in principle. Historical contingency is a defining feature of living systems, not a flaw. Jacob called evolution a tinkerer, not an engineer; the recurrent laryngeal nerve, which loops down around an artery near the heart and back up to the larynx (several meters round trip in a giraffe), is the standard example. Gould and Lewontin add the caution that not every feature is an adaptation; some are byproducts.</w:t>
+      </w:r>
+    </w:p>
+    <w:bookmarkEnd w:id="25"/>
+    <w:bookmarkStart w:id="26" w:name="the-brain-as-an-adaptive-control-system"/>
     <w:p>
       <w:pPr>
         <w:pStyle w:val="Heading2"/>
@@ -390,7 +460,7 @@
         <w:pStyle w:val="FirstParagraph"/>
       </w:pPr>
       <w:r>
-        <w:t xml:space="preserve">The chapter’s positive proposal: view the brain as an adaptive control system embedded in a body, regulating behavior in an environment that is uncertain, dynamic, and only partially observable. Perception and action are continuously coupled. The system adjusts its own internal organization based on the consequences of its behavior.</w:t>
+        <w:t xml:space="preserve">The chapter’s positive proposal: view the brain as an adaptive control system embedded in a body, regulating behavior in an environment that is uncertain, dynamic, and only partially observable. Perception and action are continuously coupled. The system adjusts its own internal organization based on the consequences of its behavior. What it controls is a set of internal variables that must stay in bounds (Cannon’s homeostasis; Ashby’s essential variables), and learning is the controller changing its own organization when old behavior no longer keeps them there. The sentence to remember: the brain generates behavior, and the world corrects it.</w:t>
       </w:r>
     </w:p>
     <w:p>
@@ -404,7 +474,25 @@
         <w:br/>
       </w:r>
       <w:r>
-        <w:t xml:space="preserve">- Perception is active inference shaped by prior experience and biological need, not passive recording.</w:t>
+        <w:t xml:space="preserve">- Perception is an active process of inference shaped by prior experience and biological need, not passive recording (Helmholtz’s</w:t>
+      </w:r>
+      <w:r>
+        <w:t xml:space="preserve"> </w:t>
+      </w:r>
+      <w:r>
+        <w:t xml:space="preserve">“</w:t>
+      </w:r>
+      <w:r>
+        <w:t xml:space="preserve">unconscious inference,</w:t>
+      </w:r>
+      <w:r>
+        <w:t xml:space="preserve">”</w:t>
+      </w:r>
+      <w:r>
+        <w:t xml:space="preserve"> </w:t>
+      </w:r>
+      <w:r>
+        <w:t xml:space="preserve">ancestor of the modern view of the brain as a prediction machine).</w:t>
       </w:r>
       <w:r>
         <w:br/>
@@ -422,7 +510,7 @@
         <w:br/>
       </w:r>
       <w:r>
-        <w:t xml:space="preserve">- The objective is viability, not truth. Accuracy matters only insofar as it serves survival, and when precision conflicts with speed, energy, or robustness, precision often loses.</w:t>
+        <w:t xml:space="preserve">- The objective is viability, not truth. Accuracy matters only insofar as it serves survival, and when precision conflicts with speed, energy, or robustness, precision often loses. Friston’s free-energy principle is one contemporary, contested attempt to formalize this; whether it adds anything to Ashby is disputed.</w:t>
       </w:r>
     </w:p>
     <w:p>
@@ -430,17 +518,17 @@
         <w:pStyle w:val="BodyText"/>
       </w:pPr>
       <w:r>
-        <w:t xml:space="preserve">This is why cognition is full of heuristics, biases, and shortcuts. They are trade-offs that favor survival under uncertainty, not bugs.</w:t>
-      </w:r>
-    </w:p>
-    <w:bookmarkEnd w:id="25"/>
-    <w:bookmarkStart w:id="26" w:name="X68f7cb770d5b093af40719d5051bbb65f991f9a"/>
+        <w:t xml:space="preserve">This is why cognition is full of heuristics, biases, and shortcuts: Simon’s satisficing, the systematic errors Tversky and Kahneman documented, and Gigerenzer and Brighton’s finding that simple rules often predict better than complex models when data are few and noisy. They are trade-offs that favor survival under uncertainty.</w:t>
+      </w:r>
+    </w:p>
+    <w:bookmarkEnd w:id="26"/>
+    <w:bookmarkStart w:id="27" w:name="X817455ffafc94d52666923631badd96a20403f6"/>
     <w:p>
       <w:pPr>
         <w:pStyle w:val="Heading2"/>
       </w:pPr>
       <w:r>
-        <w:t xml:space="preserve">Noise, redundancy, and the myth of optimization</w:t>
+        <w:t xml:space="preserve">Noise, degeneracy, and the myth of optimization</w:t>
       </w:r>
     </w:p>
     <w:p>
@@ -448,78 +536,144 @@
         <w:pStyle w:val="FirstParagraph"/>
       </w:pPr>
       <w:r>
-        <w:t xml:space="preserve">Engineers remove noise and redundancy. The brain keeps both and uses them:</w:t>
+        <w:t xml:space="preserve">Engineers suppress noise, and they use redundancy deliberately, by duplication: error-correcting memory, mirrored disks, triple-redundant flight computers. The brain is built from far noisier parts, and its redundancy is of a different kind.</w:t>
+      </w:r>
+    </w:p>
+    <w:p>
+      <w:pPr>
+        <w:pStyle w:val="BodyText"/>
+      </w:pPr>
+      <w:r>
+        <w:t xml:space="preserve">The noise is measurable. Allen and Stevens (1994) found that more than half of the impulses arriving at single hippocampal synapses evoked no response; Shadlen and Newsome found that the spike-count variance of cortical neurons to repeated identical stimuli is about as large as the mean.</w:t>
+      </w:r>
+    </w:p>
+    <w:p>
+      <w:pPr>
+        <w:pStyle w:val="BodyText"/>
+      </w:pPr>
+      <w:r>
+        <w:t xml:space="preserve">The brain uses rather than eliminates this variability:</w:t>
       </w:r>
       <w:r>
         <w:br/>
       </w:r>
       <w:r>
-        <w:t xml:space="preserve">- Populations of neurons average over the noise of individual cells.</w:t>
+        <w:t xml:space="preserve">- Populations of neurons average over the failures of their members.</w:t>
       </w:r>
       <w:r>
         <w:br/>
       </w:r>
       <w:r>
-        <w:t xml:space="preserve">- Redundant pathways provide resilience when synapses fail or neurons die.</w:t>
+        <w:t xml:space="preserve">- Feedback stabilizes dynamics, and homeostatic plasticity (Turrigiano and Nelson) scales a neuron’s synapses over hours and days to hold its average activity in a working range.</w:t>
       </w:r>
       <w:r>
         <w:br/>
       </w:r>
       <w:r>
-        <w:t xml:space="preserve">- Feedback stabilizes dynamics.</w:t>
+        <w:t xml:space="preserve">- Inhibition prevents runaway excitation (Chapter 4); slow cortical learning is itself a stabilizing device (Chapter 5); distributed representations remove single points of failure.</w:t>
+      </w:r>
+    </w:p>
+    <w:p>
+      <w:pPr>
+        <w:pStyle w:val="BodyText"/>
+      </w:pPr>
+      <w:r>
+        <w:t xml:space="preserve">Degeneracy (Edelman and Gally) is the ability of structurally different elements to perform the same function: many different neuron combinations can produce the same movement, many synaptic configurations can store the same memory. Unlike duplicated copies, which all fail under the same unanticipated condition, degenerate elements offer many partially independent answers, and they are raw material for evolution. Recovery after stroke is degeneracy at work: surviving tissue is not a spare copy but can be taught to do part of the lost tissue’s job.</w:t>
+      </w:r>
+    </w:p>
+    <w:p>
+      <w:pPr>
+        <w:pStyle w:val="BodyText"/>
+      </w:pPr>
+      <w:r>
+        <w:t xml:space="preserve">“</w:t>
+      </w:r>
+      <w:r>
+        <w:t xml:space="preserve">Optimization</w:t>
+      </w:r>
+      <w:r>
+        <w:t xml:space="preserve">”</w:t>
+      </w:r>
+      <w:r>
+        <w:t xml:space="preserve"> </w:t>
+      </w:r>
+      <w:r>
+        <w:t xml:space="preserve">in biology means maintaining function across a wide range of conditions with limited resources, not maximizing a benchmark score. Judged by that standard, and by the 20-watt budget, Sterling and Laughlin argue the nervous system is near-optimal. Nor does the brain optimize nothing: there is no single global objective minimized by gradient descent, but many circuits are well described as minimizing a local error or cost, such as the reward prediction error signaled by a large population of dopamine neurons (Chapter 3), sensory prediction error (Chapter 6), and near-optimal cue combination (Chapter 6).</w:t>
+      </w:r>
+    </w:p>
+    <w:bookmarkEnd w:id="27"/>
+    <w:bookmarkStart w:id="28" w:name="why-this-matters-before-we-study-neurons"/>
+    <w:p>
+      <w:pPr>
+        <w:pStyle w:val="Heading2"/>
+      </w:pPr>
+      <w:r>
+        <w:t xml:space="preserve">Why this matters before we study neurons</w:t>
+      </w:r>
+    </w:p>
+    <w:p>
+      <w:pPr>
+        <w:pStyle w:val="FirstParagraph"/>
+      </w:pPr>
+      <w:r>
+        <w:t xml:space="preserve">The mechanisms in Chapter 2 (electrical signaling, chemical communication, physical change with use) look arbitrary or overcomplicated without this frame, and intelligible with it. The sentence to keep: the brain is not an engineered solution to a clean problem; it is an evolved solution to a messy one. The chapter closes on Cajal’s 1899 drawing of a Purkinje cell (Golgi stain): a dendritic tree with on the order of 200,000 inputs and a single axon that is the only output of the cerebellar cortex, a component whose shape is a wiring solution and whose synapses help the cerebellum learn to correct movements (Chapter 4).</w:t>
+      </w:r>
+    </w:p>
+    <w:bookmarkEnd w:id="28"/>
+    <w:bookmarkStart w:id="29" w:name="implications-for-artificial-intelligence"/>
+    <w:p>
+      <w:pPr>
+        <w:pStyle w:val="Heading2"/>
+      </w:pPr>
+      <w:r>
+        <w:t xml:space="preserve">Implications for artificial intelligence</w:t>
+      </w:r>
+    </w:p>
+    <w:p>
+      <w:pPr>
+        <w:pStyle w:val="FirstParagraph"/>
+      </w:pPr>
+      <w:r>
+        <w:t xml:space="preserve">The chapter draws four lessons and a caution:</w:t>
       </w:r>
       <w:r>
         <w:br/>
       </w:r>
       <w:r>
-        <w:t xml:space="preserve">- Slow learning prevents catastrophic instability; inhibition prevents runaway excitation; distributed representations remove single points of failure.</w:t>
-      </w:r>
-    </w:p>
-    <w:p>
-      <w:pPr>
-        <w:pStyle w:val="BodyText"/>
-      </w:pPr>
-      <w:r>
-        <w:t xml:space="preserve">“</w:t>
-      </w:r>
-      <w:r>
-        <w:t xml:space="preserve">Optimization</w:t>
-      </w:r>
-      <w:r>
-        <w:t xml:space="preserve">”</w:t>
-      </w:r>
-      <w:r>
-        <w:t xml:space="preserve"> </w:t>
-      </w:r>
-      <w:r>
-        <w:t xml:space="preserve">in biology means maintaining function across a wide range of conditions with limited resources, not maximizing a benchmark score. Judged by that standard, the brain is not inefficient.</w:t>
-      </w:r>
-    </w:p>
-    <w:bookmarkEnd w:id="26"/>
-    <w:bookmarkStart w:id="27" w:name="why-this-matters-before-we-study-neurons"/>
+        <w:t xml:space="preserve">- Energy: the 20-watt budget forced sparse activity, low rates, local wiring, and prediction; as power becomes the binding constraint for AI, these economies are a design guide.</w:t>
+      </w:r>
+      <w:r>
+        <w:br/>
+      </w:r>
+      <w:r>
+        <w:t xml:space="preserve">- Noise: artificial networks are deterministic and made robust only as an afterthought; noise injection and distributed representations rediscover the brain’s strategy.</w:t>
+      </w:r>
+      <w:r>
+        <w:br/>
+      </w:r>
+      <w:r>
+        <w:t xml:space="preserve">- No reset: catastrophic interference is still unsolved in general for artificial networks. The brain’s answer, a fast learner replaying into a slow one, was arrived at independently in machine learning as experience replay (Lin 1992 predates the discovery of hippocampal replay in 1994; the two are convergent, not a borrowing).</w:t>
+      </w:r>
+      <w:r>
+        <w:br/>
+      </w:r>
+      <w:r>
+        <w:t xml:space="preserve">- Control: most artificial systems are trained and then frozen; the brain generates behavior, observes consequences, and corrects, never frozen. Reinforcement learning faces the same problems of partial observability and delayed, noisy feedback.</w:t>
+      </w:r>
+      <w:r>
+        <w:br/>
+      </w:r>
+      <w:r>
+        <w:t xml:space="preserve">- Caution: the brain’s solutions are not the only ones. Some respond to constraints silicon does not share (no exact copies, no clock, no reset) and would be foolish to imitate; the point is to know which is which.</w:t>
+      </w:r>
+    </w:p>
+    <w:bookmarkEnd w:id="29"/>
+    <w:bookmarkStart w:id="30" w:name="practical-summary"/>
     <w:p>
       <w:pPr>
         <w:pStyle w:val="Heading2"/>
       </w:pPr>
       <w:r>
-        <w:t xml:space="preserve">Why this matters before we study neurons</w:t>
-      </w:r>
-    </w:p>
-    <w:p>
-      <w:pPr>
-        <w:pStyle w:val="FirstParagraph"/>
-      </w:pPr>
-      <w:r>
-        <w:t xml:space="preserve">The mechanisms in Chapter 2 (electrical signaling, chemical communication, physical change with use) look arbitrary or overcomplicated without this frame, and intelligible with it. The sentence to keep: the brain is not an engineered solution to a clean problem; it is an evolved solution to a messy one.</w:t>
-      </w:r>
-    </w:p>
-    <w:bookmarkEnd w:id="27"/>
-    <w:bookmarkStart w:id="28" w:name="practical-summary"/>
-    <w:p>
-      <w:pPr>
-        <w:pStyle w:val="Heading2"/>
-      </w:pPr>
-      <w:r>
         <w:t xml:space="preserve">Practical summary</w:t>
       </w:r>
     </w:p>
@@ -544,7 +698,7 @@
         <w:pStyle w:val="Compact"/>
       </w:pPr>
       <w:r>
-        <w:t xml:space="preserve">The brain is matter. Every cognitive property is a property of tissue: slow, energy-limited, noisy, persistent.</w:t>
+        <w:t xml:space="preserve">The brain is matter. Every cognitive property is a property of tissue: slow, energy-limited (about 20 watts), noisy, persistent.</w:t>
       </w:r>
     </w:p>
     <w:p>
@@ -556,6 +710,18 @@
         <w:pStyle w:val="Compact"/>
       </w:pPr>
       <w:r>
+        <w:t xml:space="preserve">Learning is slow for two reasons: lasting change is molecular construction, and fast change would overwrite old knowledge (complementary learning systems).</w:t>
+      </w:r>
+    </w:p>
+    <w:p>
+      <w:pPr>
+        <w:numPr>
+          <w:ilvl w:val="0"/>
+          <w:numId w:val="1002"/>
+        </w:numPr>
+        <w:pStyle w:val="Compact"/>
+      </w:pPr>
+      <w:r>
         <w:t xml:space="preserve">There is no reset. Learning is incremental, history-dependent, and early experience sets the initial conditions.</w:t>
       </w:r>
     </w:p>
@@ -568,7 +734,7 @@
         <w:pStyle w:val="Compact"/>
       </w:pPr>
       <w:r>
-        <w:t xml:space="preserve">The brain is an adaptive controller whose objective is viability, not truth. Heuristics and biases are trade-offs.</w:t>
+        <w:t xml:space="preserve">The brain is an adaptive controller whose objective is viability, not truth. It generates behavior, and the world corrects it. Heuristics and biases are trade-offs.</w:t>
       </w:r>
     </w:p>
     <w:p>
@@ -580,7 +746,7 @@
         <w:pStyle w:val="Compact"/>
       </w:pPr>
       <w:r>
-        <w:t xml:space="preserve">Noise and redundancy are exploited, not eliminated. Biological optimization means robustness under constraint.</w:t>
+        <w:t xml:space="preserve">Noise is exploited, not eliminated, and the brain’s redundancy is degeneracy rather than duplication. Biological optimization means robustness under constraint, and many circuits do minimize local errors even though there is no single global objective.</w:t>
       </w:r>
     </w:p>
     <w:p>
@@ -593,119 +759,119 @@
       </w:pPr>
       <w:r>
         <w:t xml:space="preserve">Suspend the intuition that apparent defects are design errors. Ask instead what problem the brain was actually solving.</w:t>
-      </w:r>
-    </w:p>
-    <w:bookmarkEnd w:id="28"/>
-    <w:bookmarkEnd w:id="29"/>
-    <w:bookmarkStart w:id="55" w:name="labs"/>
-    <w:p>
-      <w:pPr>
-        <w:pStyle w:val="Heading1"/>
-      </w:pPr>
-      <w:r>
-        <w:t xml:space="preserve">Labs</w:t>
-      </w:r>
-    </w:p>
-    <w:bookmarkStart w:id="31" w:name="lab-notes-how-to-succeed-in-these-labs"/>
-    <w:p>
-      <w:pPr>
-        <w:pStyle w:val="Heading2"/>
-      </w:pPr>
-      <w:r>
-        <w:t xml:space="preserve">Lab Notes: how to succeed in these labs</w:t>
-      </w:r>
-    </w:p>
-    <w:p>
-      <w:pPr>
-        <w:pStyle w:val="FirstParagraph"/>
-      </w:pPr>
-      <w:r>
-        <w:t xml:space="preserve">Chapter 1 is conceptual, so these labs are mostly about making your own assumptions explicit and then testing them against small, concrete models. Several labs ask you to compute; the arithmetic is deliberately simple. The value is in seeing a principle appear in numbers you produced yourself.</w:t>
-      </w:r>
-    </w:p>
-    <w:p>
-      <w:pPr>
-        <w:pStyle w:val="BodyText"/>
-      </w:pPr>
-      <w:r>
-        <w:t xml:space="preserve">General rules:</w:t>
-      </w:r>
-      <w:r>
-        <w:br/>
-      </w:r>
-      <w:r>
-        <w:t xml:space="preserve">1) Write your assumptions down before you start; you will compare them with your conclusions.</w:t>
-      </w:r>
-      <w:r>
-        <w:br/>
-      </w:r>
-      <w:r>
-        <w:t xml:space="preserve">2) Draw the system where a diagram is requested.</w:t>
-      </w:r>
-      <w:r>
-        <w:br/>
-      </w:r>
-      <w:r>
-        <w:t xml:space="preserve">3) Finish every lab with an interpretation that says what would change if the constraints changed.</w:t>
-      </w:r>
-    </w:p>
-    <w:bookmarkStart w:id="30" w:name="what-to-hand-in-for-every-lab"/>
-    <w:p>
-      <w:pPr>
-        <w:pStyle w:val="Heading3"/>
-      </w:pPr>
-      <w:r>
-        <w:t xml:space="preserve">What to hand in for every lab</w:t>
-      </w:r>
-    </w:p>
-    <w:p>
-      <w:pPr>
-        <w:numPr>
-          <w:ilvl w:val="0"/>
-          <w:numId w:val="1003"/>
-        </w:numPr>
-        <w:pStyle w:val="Compact"/>
-      </w:pPr>
-      <w:r>
-        <w:t xml:space="preserve">A clean diagram or table (a photo of a hand drawing is fine).</w:t>
-      </w:r>
-    </w:p>
-    <w:p>
-      <w:pPr>
-        <w:numPr>
-          <w:ilvl w:val="0"/>
-          <w:numId w:val="1003"/>
-        </w:numPr>
-        <w:pStyle w:val="Compact"/>
-      </w:pPr>
-      <w:r>
-        <w:t xml:space="preserve">Any calculations, with intermediate values.</w:t>
-      </w:r>
-    </w:p>
-    <w:p>
-      <w:pPr>
-        <w:numPr>
-          <w:ilvl w:val="0"/>
-          <w:numId w:val="1003"/>
-        </w:numPr>
-        <w:pStyle w:val="Compact"/>
-      </w:pPr>
-      <w:r>
-        <w:t xml:space="preserve">A short interpretation (6-12 sentences).</w:t>
       </w:r>
     </w:p>
     <w:bookmarkEnd w:id="30"/>
     <w:bookmarkEnd w:id="31"/>
-    <w:bookmarkStart w:id="36" w:name="Xd1e19a5065a454792ff2681f870ae1cc8ea4760"/>
+    <w:bookmarkStart w:id="57" w:name="labs"/>
+    <w:p>
+      <w:pPr>
+        <w:pStyle w:val="Heading1"/>
+      </w:pPr>
+      <w:r>
+        <w:t xml:space="preserve">Labs</w:t>
+      </w:r>
+    </w:p>
+    <w:bookmarkStart w:id="33" w:name="lab-notes-how-to-succeed-in-these-labs"/>
     <w:p>
       <w:pPr>
         <w:pStyle w:val="Heading2"/>
       </w:pPr>
       <w:r>
+        <w:t xml:space="preserve">Lab Notes: how to succeed in these labs</w:t>
+      </w:r>
+    </w:p>
+    <w:p>
+      <w:pPr>
+        <w:pStyle w:val="FirstParagraph"/>
+      </w:pPr>
+      <w:r>
+        <w:t xml:space="preserve">Chapter 1 is conceptual, so these labs are mostly about making your own assumptions explicit and then testing them against small, concrete models. Several labs ask you to compute; the arithmetic is deliberately simple. The value is in seeing a principle appear in numbers you produced yourself.</w:t>
+      </w:r>
+    </w:p>
+    <w:p>
+      <w:pPr>
+        <w:pStyle w:val="BodyText"/>
+      </w:pPr>
+      <w:r>
+        <w:t xml:space="preserve">General rules:</w:t>
+      </w:r>
+      <w:r>
+        <w:br/>
+      </w:r>
+      <w:r>
+        <w:t xml:space="preserve">1) Write your assumptions down before you start; you will compare them with your conclusions.</w:t>
+      </w:r>
+      <w:r>
+        <w:br/>
+      </w:r>
+      <w:r>
+        <w:t xml:space="preserve">2) Draw the system where a diagram is requested.</w:t>
+      </w:r>
+      <w:r>
+        <w:br/>
+      </w:r>
+      <w:r>
+        <w:t xml:space="preserve">3) Finish every lab with an interpretation that says what would change if the constraints changed.</w:t>
+      </w:r>
+    </w:p>
+    <w:bookmarkStart w:id="32" w:name="what-to-hand-in-for-every-lab"/>
+    <w:p>
+      <w:pPr>
+        <w:pStyle w:val="Heading3"/>
+      </w:pPr>
+      <w:r>
+        <w:t xml:space="preserve">What to hand in for every lab</w:t>
+      </w:r>
+    </w:p>
+    <w:p>
+      <w:pPr>
+        <w:numPr>
+          <w:ilvl w:val="0"/>
+          <w:numId w:val="1003"/>
+        </w:numPr>
+        <w:pStyle w:val="Compact"/>
+      </w:pPr>
+      <w:r>
+        <w:t xml:space="preserve">A clean diagram or table (a photo of a hand drawing is fine).</w:t>
+      </w:r>
+    </w:p>
+    <w:p>
+      <w:pPr>
+        <w:numPr>
+          <w:ilvl w:val="0"/>
+          <w:numId w:val="1003"/>
+        </w:numPr>
+        <w:pStyle w:val="Compact"/>
+      </w:pPr>
+      <w:r>
+        <w:t xml:space="preserve">Any calculations, with intermediate values.</w:t>
+      </w:r>
+    </w:p>
+    <w:p>
+      <w:pPr>
+        <w:numPr>
+          <w:ilvl w:val="0"/>
+          <w:numId w:val="1003"/>
+        </w:numPr>
+        <w:pStyle w:val="Compact"/>
+      </w:pPr>
+      <w:r>
+        <w:t xml:space="preserve">A short interpretation (6-12 sentences).</w:t>
+      </w:r>
+    </w:p>
+    <w:bookmarkEnd w:id="32"/>
+    <w:bookmarkEnd w:id="33"/>
+    <w:bookmarkStart w:id="38" w:name="Xd1e19a5065a454792ff2681f870ae1cc8ea4760"/>
+    <w:p>
+      <w:pPr>
+        <w:pStyle w:val="Heading2"/>
+      </w:pPr>
+      <w:r>
         <w:t xml:space="preserve">Lab 1.1 - Brains vs Computers (structured comparison)</w:t>
       </w:r>
     </w:p>
-    <w:bookmarkStart w:id="32" w:name="purpose"/>
+    <w:bookmarkStart w:id="34" w:name="purpose"/>
     <w:p>
       <w:pPr>
         <w:pStyle w:val="Heading3"/>
@@ -722,8 +888,8 @@
         <w:t xml:space="preserve">To construct, from the chapter and your own knowledge, an explicit comparison between digital computers and biological brains, and to trace each difference to the constraint that produced it.</w:t>
       </w:r>
     </w:p>
-    <w:bookmarkEnd w:id="32"/>
-    <w:bookmarkStart w:id="33" w:name="materials"/>
+    <w:bookmarkEnd w:id="34"/>
+    <w:bookmarkStart w:id="35" w:name="materials"/>
     <w:p>
       <w:pPr>
         <w:pStyle w:val="Heading3"/>
@@ -740,8 +906,8 @@
         <w:t xml:space="preserve">Notebook, pen or pencil.</w:t>
       </w:r>
     </w:p>
-    <w:bookmarkEnd w:id="33"/>
-    <w:bookmarkStart w:id="34" w:name="procedure"/>
+    <w:bookmarkEnd w:id="35"/>
+    <w:bookmarkStart w:id="36" w:name="procedure"/>
     <w:p>
       <w:pPr>
         <w:pStyle w:val="Heading3"/>
@@ -951,8 +1117,8 @@
         <w:t xml:space="preserve">Write 8-12 sentences: which difference in your table did you find most surprising, and which computational term do you now consider most dangerous?</w:t>
       </w:r>
     </w:p>
-    <w:bookmarkEnd w:id="34"/>
-    <w:bookmarkStart w:id="35" w:name="what-to-record"/>
+    <w:bookmarkEnd w:id="36"/>
+    <w:bookmarkStart w:id="37" w:name="what-to-record"/>
     <w:p>
       <w:pPr>
         <w:pStyle w:val="Heading3"/>
@@ -969,9 +1135,9 @@
         <w:t xml:space="preserve">The four-column table, the three sentences with their analysis, and your interpretation.</w:t>
       </w:r>
     </w:p>
-    <w:bookmarkEnd w:id="35"/>
-    <w:bookmarkEnd w:id="36"/>
-    <w:bookmarkStart w:id="42" w:name="Xbd8c66c4feac4362b499d942797ffe62ad8924d"/>
+    <w:bookmarkEnd w:id="37"/>
+    <w:bookmarkEnd w:id="38"/>
+    <w:bookmarkStart w:id="44" w:name="Xbd8c66c4feac4362b499d942797ffe62ad8924d"/>
     <w:p>
       <w:pPr>
         <w:pStyle w:val="Heading2"/>
@@ -980,7 +1146,7 @@
         <w:t xml:space="preserve">Lab 1.2 - No Reset Button (history-dependent learning by hand)</w:t>
       </w:r>
     </w:p>
-    <w:bookmarkStart w:id="37" w:name="purpose-1"/>
+    <w:bookmarkStart w:id="39" w:name="purpose-1"/>
     <w:p>
       <w:pPr>
         <w:pStyle w:val="Heading3"/>
@@ -997,8 +1163,8 @@
         <w:t xml:space="preserve">To feel, numerically, why a system that cannot reset is shaped by the order of its experiences, why early experiences have outsized effects, and why undoing learning is expensive.</w:t>
       </w:r>
     </w:p>
-    <w:bookmarkEnd w:id="37"/>
-    <w:bookmarkStart w:id="38" w:name="given-model"/>
+    <w:bookmarkEnd w:id="39"/>
+    <w:bookmarkStart w:id="40" w:name="given-model"/>
     <w:p>
       <w:pPr>
         <w:pStyle w:val="Heading3"/>
@@ -1033,8 +1199,8 @@
         <w:t xml:space="preserve">Plasticity declines with experience, as it does during development: alpha_t = 0.5 * 0.7^(t-1), so alpha_1 = 0.50, alpha_2 = 0.35, alpha_3 = 0.245, alpha_4 = 0.1715.</w:t>
       </w:r>
     </w:p>
-    <w:bookmarkEnd w:id="38"/>
-    <w:bookmarkStart w:id="39" w:name="setup-diagram"/>
+    <w:bookmarkEnd w:id="40"/>
+    <w:bookmarkStart w:id="41" w:name="setup-diagram"/>
     <w:p>
       <w:pPr>
         <w:pStyle w:val="Heading3"/>
@@ -1067,8 +1233,8 @@
         <w:t xml:space="preserve">You will plot the trajectory of w for two different orderings on this line.</w:t>
       </w:r>
     </w:p>
-    <w:bookmarkEnd w:id="39"/>
-    <w:bookmarkStart w:id="40" w:name="procedure-1"/>
+    <w:bookmarkEnd w:id="41"/>
+    <w:bookmarkStart w:id="42" w:name="procedure-1"/>
     <w:p>
       <w:pPr>
         <w:pStyle w:val="Heading3"/>
@@ -1247,8 +1413,8 @@
         <w:t xml:space="preserve">is not an available operation? Name one thing the model leaves out that the real brain has.</w:t>
       </w:r>
     </w:p>
-    <w:bookmarkEnd w:id="40"/>
-    <w:bookmarkStart w:id="41" w:name="X10d9b91b781dcb66802a72e57dff1b24da2f12a"/>
+    <w:bookmarkEnd w:id="42"/>
+    <w:bookmarkStart w:id="43" w:name="X10d9b91b781dcb66802a72e57dff1b24da2f12a"/>
     <w:p>
       <w:pPr>
         <w:pStyle w:val="Heading3"/>
@@ -1265,9 +1431,9 @@
         <w:t xml:space="preserve">Implement the update rule and run 1,000 random sequences of ten experiences each, half +1 and half -1 in random order. Plot the distribution of final w. Then repeat with constant alpha = 0.3 and compare. Which schedule produces more diverse adults from the same set of experiences?</w:t>
       </w:r>
     </w:p>
-    <w:bookmarkEnd w:id="41"/>
-    <w:bookmarkEnd w:id="42"/>
-    <w:bookmarkStart w:id="47" w:name="X372eeeae490ab86881d3ed9f48f8621f1c1e624"/>
+    <w:bookmarkEnd w:id="43"/>
+    <w:bookmarkEnd w:id="44"/>
+    <w:bookmarkStart w:id="49" w:name="X372eeeae490ab86881d3ed9f48f8621f1c1e624"/>
     <w:p>
       <w:pPr>
         <w:pStyle w:val="Heading2"/>
@@ -1276,7 +1442,7 @@
         <w:t xml:space="preserve">Lab 1.3 - Noise and Redundancy (why unreliable parts make a reliable system)</w:t>
       </w:r>
     </w:p>
-    <w:bookmarkStart w:id="43" w:name="purpose-2"/>
+    <w:bookmarkStart w:id="45" w:name="purpose-2"/>
     <w:p>
       <w:pPr>
         <w:pStyle w:val="Heading3"/>
@@ -1293,8 +1459,8 @@
         <w:t xml:space="preserve">To show with dice that averaging over noisy components and duplicating unreliable pathways produce reliability that no single component has, and to make the cost of that strategy explicit.</w:t>
       </w:r>
     </w:p>
-    <w:bookmarkEnd w:id="43"/>
-    <w:bookmarkStart w:id="44" w:name="materials-1"/>
+    <w:bookmarkEnd w:id="45"/>
+    <w:bookmarkStart w:id="46" w:name="materials-1"/>
     <w:p>
       <w:pPr>
         <w:pStyle w:val="Heading3"/>
@@ -1311,8 +1477,8 @@
         <w:t xml:space="preserve">One or more six-sided dice, notebook, calculator (recommended).</w:t>
       </w:r>
     </w:p>
-    <w:bookmarkEnd w:id="44"/>
-    <w:bookmarkStart w:id="45" w:name="given-model-1"/>
+    <w:bookmarkEnd w:id="46"/>
+    <w:bookmarkStart w:id="47" w:name="given-model-1"/>
     <w:p>
       <w:pPr>
         <w:pStyle w:val="Heading3"/>
@@ -1341,8 +1507,8 @@
         <w:t xml:space="preserve">Each synapse transmits a spike with probability 1/2 (roll 4, 5, or 6 = transmitted).</w:t>
       </w:r>
     </w:p>
-    <w:bookmarkEnd w:id="45"/>
-    <w:bookmarkStart w:id="46" w:name="procedure-2"/>
+    <w:bookmarkEnd w:id="47"/>
+    <w:bookmarkStart w:id="48" w:name="procedure-2"/>
     <w:p>
       <w:pPr>
         <w:pStyle w:val="Heading3"/>
@@ -1483,9 +1649,9 @@
         <w:t xml:space="preserve">Write 8-12 sentences: why would evolution pay for redundancy instead of building a reliable synapse? What does the organism gain when a neuron dies in the redundant design versus the single-component design? Where does the strategy stop paying off?</w:t>
       </w:r>
     </w:p>
-    <w:bookmarkEnd w:id="46"/>
-    <w:bookmarkEnd w:id="47"/>
-    <w:bookmarkStart w:id="51" w:name="X1d72ebd0c0581b86c9712d8d57d935ebe006429"/>
+    <w:bookmarkEnd w:id="48"/>
+    <w:bookmarkEnd w:id="49"/>
+    <w:bookmarkStart w:id="53" w:name="X1d72ebd0c0581b86c9712d8d57d935ebe006429"/>
     <w:p>
       <w:pPr>
         <w:pStyle w:val="Heading2"/>
@@ -1494,7 +1660,7 @@
         <w:t xml:space="preserve">Lab 1.4 - Viability, Not Truth (decisions under asymmetric cost)</w:t>
       </w:r>
     </w:p>
-    <w:bookmarkStart w:id="48" w:name="purpose-3"/>
+    <w:bookmarkStart w:id="50" w:name="purpose-3"/>
     <w:p>
       <w:pPr>
         <w:pStyle w:val="Heading3"/>
@@ -1529,8 +1695,8 @@
         <w:t xml:space="preserve">decision rule can be the correct one for an organism whose objective is survival, and to see the speed-accuracy trade-off in numbers.</w:t>
       </w:r>
     </w:p>
-    <w:bookmarkEnd w:id="48"/>
-    <w:bookmarkStart w:id="49" w:name="given-model-2"/>
+    <w:bookmarkEnd w:id="50"/>
+    <w:bookmarkStart w:id="51" w:name="given-model-2"/>
     <w:p>
       <w:pPr>
         <w:pStyle w:val="Heading3"/>
@@ -1559,8 +1725,8 @@
         <w:t xml:space="preserve">Staying costs 0 if nothing is there and 100 units if a predator is there.</w:t>
       </w:r>
     </w:p>
-    <w:bookmarkEnd w:id="49"/>
-    <w:bookmarkStart w:id="50" w:name="procedure-3"/>
+    <w:bookmarkEnd w:id="51"/>
+    <w:bookmarkStart w:id="52" w:name="procedure-3"/>
     <w:p>
       <w:pPr>
         <w:pStyle w:val="Heading3"/>
@@ -1725,9 +1891,9 @@
         <w:t xml:space="preserve">means for a system whose objective is to remain alive rather than to be right? Name one human cognitive bias that fits this template.</w:t>
       </w:r>
     </w:p>
-    <w:bookmarkEnd w:id="50"/>
-    <w:bookmarkEnd w:id="51"/>
-    <w:bookmarkStart w:id="54" w:name="Xa96759888e6b48fa8aeaf9065cc26a0495d6d8b"/>
+    <w:bookmarkEnd w:id="52"/>
+    <w:bookmarkEnd w:id="53"/>
+    <w:bookmarkStart w:id="56" w:name="Xa96759888e6b48fa8aeaf9065cc26a0495d6d8b"/>
     <w:p>
       <w:pPr>
         <w:pStyle w:val="Heading2"/>
@@ -1736,7 +1902,7 @@
         <w:t xml:space="preserve">Lab 1.5 - Engineering Autopsy and AI Reflection</w:t>
       </w:r>
     </w:p>
-    <w:bookmarkStart w:id="52" w:name="purpose-4"/>
+    <w:bookmarkStart w:id="54" w:name="purpose-4"/>
     <w:p>
       <w:pPr>
         <w:pStyle w:val="Heading3"/>
@@ -1753,8 +1919,8 @@
         <w:t xml:space="preserve">To practice the chapter’s central move: when the brain looks badly engineered, identify the problem it was actually solving. Then to test the chapter’s principles against an artificial system you know.</w:t>
       </w:r>
     </w:p>
-    <w:bookmarkEnd w:id="52"/>
-    <w:bookmarkStart w:id="53" w:name="procedure-4"/>
+    <w:bookmarkEnd w:id="54"/>
+    <w:bookmarkStart w:id="55" w:name="procedure-4"/>
     <w:p>
       <w:pPr>
         <w:pStyle w:val="Heading3"/>
@@ -1881,9 +2047,9 @@
         <w:t xml:space="preserve">Write 10-14 sentences: which of the chapter’s principles does your system already honor, which does it violate, and which violation would you fix first if the system had to keep itself viable in an open environment rather than score well on a benchmark?</w:t>
       </w:r>
     </w:p>
-    <w:bookmarkEnd w:id="53"/>
-    <w:bookmarkEnd w:id="54"/>
     <w:bookmarkEnd w:id="55"/>
+    <w:bookmarkEnd w:id="56"/>
+    <w:bookmarkEnd w:id="57"/>
     <w:sectPr>
       <w:pgSz w:h="15840" w:w="12240"/>
       <w:pgMar w:bottom="1440" w:left="1440" w:right="1440" w:top="1440"/>

</xml_diff>